<commit_message>
chore: add the equations, text-effects, table-layout, page-layout, outline-numbering, and ruby fixtures
</commit_message>
<xml_diff>
--- a/tests/fixtures/pages/sources/alt-text.docx
+++ b/tests/fixtures/pages/sources/alt-text.docx
@@ -1,6 +1,6 @@
 
 <file path=word/document.xml><?xml version="1.0" encoding="utf-8"?>
-<w:document xmlns:w="http://schemas.openxmlformats.org/wordprocessingml/2006/main" xmlns:r="http://schemas.openxmlformats.org/officeDocument/2006/relationships" xmlns:wp="http://schemas.openxmlformats.org/drawingml/2006/wordprocessingDrawing" xmlns:a="http://schemas.openxmlformats.org/drawingml/2006/main" xmlns:pic="http://schemas.openxmlformats.org/drawingml/2006/picture">
+<w:document xmlns:w="http://schemas.openxmlformats.org/wordprocessingml/2006/main" xmlns:r="http://schemas.openxmlformats.org/officeDocument/2006/relationships" xmlns:wp="http://schemas.openxmlformats.org/drawingml/2006/wordprocessingDrawing" xmlns:a="http://schemas.openxmlformats.org/drawingml/2006/main" xmlns:pic="http://schemas.openxmlformats.org/drawingml/2006/picture" xmlns:m="http://schemas.openxmlformats.org/officeDocument/2006/math">
   <w:body>
     <w:p>
       <w:pPr>
@@ -145,6 +145,39 @@
       </w:pPr>
     </w:lvl>
   </w:abstractNum>
+  <w:abstractNum w:abstractNumId="3">
+    <w:multiLevelType w:val="multilevel"/>
+    <w:lvl w:ilvl="0">
+      <w:start w:val="1"/>
+      <w:numFmt w:val="decimal"/>
+      <w:isLgl/>
+      <w:lvlText w:val="%1."/>
+      <w:lvlJc w:val="left"/>
+      <w:pPr>
+        <w:ind w:left="432" w:hanging="360"/>
+      </w:pPr>
+    </w:lvl>
+    <w:lvl w:ilvl="1">
+      <w:start w:val="1"/>
+      <w:numFmt w:val="decimal"/>
+      <w:isLgl/>
+      <w:lvlText w:val="%1.%2."/>
+      <w:lvlJc w:val="left"/>
+      <w:pPr>
+        <w:ind w:left="864" w:hanging="360"/>
+      </w:pPr>
+    </w:lvl>
+    <w:lvl w:ilvl="2">
+      <w:start w:val="1"/>
+      <w:numFmt w:val="decimal"/>
+      <w:isLgl/>
+      <w:lvlText w:val="%1.%2.%3."/>
+      <w:lvlJc w:val="left"/>
+      <w:pPr>
+        <w:ind w:left="1296" w:hanging="360"/>
+      </w:pPr>
+    </w:lvl>
+  </w:abstractNum>
   <w:num w:numId="1">
     <w:abstractNumId w:val="0"/>
   </w:num>
@@ -165,6 +198,9 @@
     <w:lvlOverride w:ilvl="0">
       <w:startOverride w:val="10"/>
     </w:lvlOverride>
+  </w:num>
+  <w:num w:numId="6">
+    <w:abstractNumId w:val="3"/>
   </w:num>
 </w:numbering>
 </file>

</xml_diff>